<commit_message>
docs: update final evidence for official dataset schema
</commit_message>
<xml_diff>
--- a/docs/final/submission/Food_Delivery_System_Final_Report.docx
+++ b/docs/final/submission/Food_Delivery_System_Final_Report.docx
@@ -145,7 +145,7 @@
     </w:p>
     <w:p>
       <w:r>
-        <w:t>normalTravelTimeMinutes * roadConditionWeight</w:t>
+        <w:t>baseTravelTimeMinutes * roadConditionMultiplier</w:t>
       </w:r>
     </w:p>
     <w:p>
@@ -211,7 +211,7 @@
           </w:tcPr>
           <w:p>
             <w:r>
-              <w:t>Locations.csv</w:t>
+              <w:t>locations.csv</w:t>
             </w:r>
           </w:p>
         </w:tc>
@@ -243,7 +243,7 @@
           </w:tcPr>
           <w:p>
             <w:r>
-              <w:t>Roads_Edges.csv</w:t>
+              <w:t>roads.csv</w:t>
             </w:r>
           </w:p>
         </w:tc>
@@ -263,7 +263,7 @@
           </w:tcPr>
           <w:p>
             <w:r>
-              <w:t>Road connections and travel weights</w:t>
+              <w:t>Road connections, road condition labels, and travel multipliers</w:t>
             </w:r>
           </w:p>
         </w:tc>
@@ -275,7 +275,7 @@
           </w:tcPr>
           <w:p>
             <w:r>
-              <w:t>Service Request.csv</w:t>
+              <w:t>service_requests.csv</w:t>
             </w:r>
           </w:p>
         </w:tc>
@@ -307,7 +307,7 @@
           </w:tcPr>
           <w:p>
             <w:r>
-              <w:t>Resource.csv</w:t>
+              <w:t>resources.csv</w:t>
             </w:r>
           </w:p>
         </w:tc>
@@ -339,7 +339,7 @@
           </w:tcPr>
           <w:p>
             <w:r>
-              <w:t>algorithm_Runs.csv</w:t>
+              <w:t>algorithm_runs.csv</w:t>
             </w:r>
           </w:p>
         </w:tc>
@@ -349,7 +349,7 @@
           </w:tcPr>
           <w:p>
             <w:r>
-              <w:t>90</w:t>
+              <w:t>60</w:t>
             </w:r>
           </w:p>
         </w:tc>
@@ -359,7 +359,7 @@
           </w:tcPr>
           <w:p>
             <w:r>
-              <w:t>Experiment/audit support data</w:t>
+              <w:t>Filtered performance support rows for implemented algorithms</w:t>
             </w:r>
           </w:p>
         </w:tc>
@@ -371,7 +371,7 @@
           </w:tcPr>
           <w:p>
             <w:r>
-              <w:t>audit_Events.csv</w:t>
+              <w:t>audit_events.csv</w:t>
             </w:r>
           </w:p>
         </w:tc>
@@ -381,7 +381,7 @@
           </w:tcPr>
           <w:p>
             <w:r>
-              <w:t>150</w:t>
+              <w:t>0</w:t>
             </w:r>
           </w:p>
         </w:tc>
@@ -391,7 +391,7 @@
           </w:tcPr>
           <w:p>
             <w:r>
-              <w:t>Audit support data</w:t>
+              <w:t>Header-only audit support file; no app-generated audit history was invented</w:t>
             </w:r>
           </w:p>
         </w:tc>
@@ -415,7 +415,7 @@
         <w:pStyle w:val="ListBullet"/>
       </w:pPr>
       <w:r>
-        <w:t>Locations.csv maps directly to Location.</w:t>
+        <w:t>locations.csv maps directly to Location.</w:t>
       </w:r>
     </w:p>
     <w:p>
@@ -423,7 +423,7 @@
         <w:pStyle w:val="ListBullet"/>
       </w:pPr>
       <w:r>
-        <w:t>Roads_Edges.csv does not contain a road ID, so stable road IDs are generated as ROAD001, ROAD002, and so on.</w:t>
+        <w:t>roads.csv contains stable road IDs as ROAD001, ROAD002, and so on.</w:t>
       </w:r>
     </w:p>
     <w:p>
@@ -439,7 +439,7 @@
         <w:pStyle w:val="ListBullet"/>
       </w:pPr>
       <w:r>
-        <w:t>travel_Time maps to normalTravelTimeMinutes.</w:t>
+        <w:t>base_travel_time_minutes maps to normal travel time.</w:t>
       </w:r>
     </w:p>
     <w:p>
@@ -447,7 +447,7 @@
         <w:pStyle w:val="ListBullet"/>
       </w:pPr>
       <w:r>
-        <w:t>roadConditionWeight maps directly.</w:t>
+        <w:t>road_condition_multiplier maps to the road condition multiplier used by routing and MST algorithms.</w:t>
       </w:r>
     </w:p>
     <w:p>
@@ -495,7 +495,7 @@
         <w:pStyle w:val="ListBullet"/>
       </w:pPr>
       <w:r>
-        <w:t>Resource.csv maps resource_Id to riderId.</w:t>
+        <w:t>resources.csv maps resource_id to riderId.</w:t>
       </w:r>
     </w:p>
     <w:p>
@@ -1201,7 +1201,7 @@
         <w:pStyle w:val="ListBullet"/>
       </w:pPr>
       <w:r>
-        <w:t>Dijkstra LOC073 -&gt; LOC076: reachable, path LOC073 -&gt; LOC076, effective time 17.00</w:t>
+        <w:t>Dijkstra LOC073 -&gt; LOC076: reachable, path LOC073 -&gt; LOC076, effective time 6.80</w:t>
       </w:r>
     </w:p>
     <w:p>
@@ -1209,7 +1209,7 @@
         <w:pStyle w:val="ListBullet"/>
       </w:pPr>
       <w:r>
-        <w:t>Prim and Kruskal: both selected 149 roads, 1 component, total effective cost 2248.00</w:t>
+        <w:t>Prim and Kruskal: both selected 149 roads, 1 component, total effective cost 1177.18</w:t>
       </w:r>
     </w:p>
     <w:p>
@@ -1793,7 +1793,7 @@
         <w:pStyle w:val="ListBullet"/>
       </w:pPr>
       <w:r>
-        <w:t>Integrate algorithm_Runs.csv and audit_Events.csv into a formal audit/report module.</w:t>
+        <w:t>Extend algorithm_runs.csv and audit_events.csv into a formal audit/report module when app-generated experiment history is required.</w:t>
       </w:r>
     </w:p>
     <w:p>

</xml_diff>

<commit_message>
docs: finalize submission details
</commit_message>
<xml_diff>
--- a/docs/final/submission/Food_Delivery_System_Final_Report.docx
+++ b/docs/final/submission/Food_Delivery_System_Final_Report.docx
@@ -30,6 +30,16 @@
     </w:p>
     <w:p>
       <w:r>
+        <w:t>**Team name:** Firewall</w:t>
+      </w:r>
+    </w:p>
+    <w:p>
+      <w:r>
+        <w:t>**Repository:** https://github.com/Miz-Data06/DCIT204-308_JointProject_Firewall.git</w:t>
+      </w:r>
+    </w:p>
+    <w:p>
+      <w:r>
         <w:t>**Package name:** com.fooddelivery</w:t>
       </w:r>
     </w:p>
@@ -45,7 +55,7 @@
     </w:p>
     <w:p>
       <w:r>
-        <w:t>**Final evidence commit before documentation:** 065972b docs: add demo evidence outputs</w:t>
+        <w:t>**Final evidence commit before submission finalization:** 6b1746b docs: update final evidence for official dataset schema</w:t>
       </w:r>
     </w:p>
     <w:p>

</xml_diff>